<commit_message>
e3 materials and questions doc
</commit_message>
<xml_diff>
--- a/E2/Gohlwar-Goohs-Norman-E2 graded.docx
+++ b/E2/Gohlwar-Goohs-Norman-E2 graded.docx
@@ -27,7 +27,6 @@
         </w:rPr>
         <w:t xml:space="preserve"> </w:t>
       </w:r>
-      <w:proofErr w:type="gramStart"/>
       <w:r>
         <w:rPr>
           <w:b/>
@@ -38,14 +37,7 @@
         <w:rPr>
           <w:b/>
         </w:rPr>
-        <w:t xml:space="preserve">  --</w:t>
-      </w:r>
-      <w:proofErr w:type="gramEnd"/>
-      <w:r>
-        <w:rPr>
-          <w:b/>
-        </w:rPr>
-        <w:t xml:space="preserve"> </w:t>
+        <w:t xml:space="preserve">  -- </w:t>
       </w:r>
       <w:r>
         <w:rPr>
@@ -396,21 +388,7 @@
         <w:rPr>
           <w:color w:val="EE0000"/>
         </w:rPr>
-        <w:t xml:space="preserve">Dispatcher sets up activation record for the IH.   It cannot be interrupted until this task is done.  </w:t>
-      </w:r>
-      <w:proofErr w:type="gramStart"/>
-      <w:r>
-        <w:rPr>
-          <w:color w:val="EE0000"/>
-        </w:rPr>
-        <w:t>Otherwise</w:t>
-      </w:r>
-      <w:proofErr w:type="gramEnd"/>
-      <w:r>
-        <w:rPr>
-          <w:color w:val="EE0000"/>
-        </w:rPr>
-        <w:t xml:space="preserve"> the AR may not be set up properly and the system is likely to crash.</w:t>
+        <w:t>Dispatcher sets up activation record for the IH.   It cannot be interrupted until this task is done.  Otherwise the AR may not be set up properly and the system is likely to crash.</w:t>
       </w:r>
     </w:p>
     <w:p>
@@ -470,6 +448,53 @@
       </w:pPr>
       <w:r>
         <w:rPr>
+          <w:b/>
+          <w:bCs/>
+          <w:color w:val="EE0000"/>
+        </w:rPr>
+        <w:t>If you could turn interrupts off in user mode</w:t>
+      </w:r>
+      <w:r>
+        <w:rPr>
+          <w:b/>
+          <w:bCs/>
+          <w:color w:val="EE0000"/>
+        </w:rPr>
+        <w:t xml:space="preserve">, the dispatcher could be disrupted and resultant issues like AR setup and beyond could be an issue. </w:t>
+      </w:r>
+      <w:r>
+        <w:rPr>
+          <w:b/>
+          <w:bCs/>
+          <w:color w:val="EE0000"/>
+        </w:rPr>
+        <w:t xml:space="preserve">Additionally, if the interrupts were </w:t>
+      </w:r>
+      <w:r>
+        <w:rPr>
+          <w:b/>
+          <w:bCs/>
+          <w:color w:val="EE0000"/>
+        </w:rPr>
+        <w:t>turned off, you couldn’t handle a page fault</w:t>
+      </w:r>
+      <w:r>
+        <w:rPr>
+          <w:b/>
+          <w:bCs/>
+          <w:color w:val="EE0000"/>
+        </w:rPr>
+        <w:t>.</w:t>
+      </w:r>
+    </w:p>
+    <w:p>
+      <w:pPr>
+        <w:pStyle w:val="p2"/>
+        <w:spacing w:before="120"/>
+        <w:ind w:left="1440"/>
+      </w:pPr>
+      <w:r>
+        <w:rPr>
           <w:highlight w:val="yellow"/>
         </w:rPr>
         <w:t xml:space="preserve">Instructions that change the state of the system and affect other executing programs are considered sensitive </w:t>
@@ -496,7 +521,14 @@
         <w:rPr>
           <w:highlight w:val="yellow"/>
         </w:rPr>
-        <w:t xml:space="preserve">– and inherently preventing the CPU from being able to respond to vital signals like </w:t>
+        <w:t xml:space="preserve">– and inherently preventing the CPU </w:t>
+      </w:r>
+      <w:r>
+        <w:rPr>
+          <w:highlight w:val="yellow"/>
+        </w:rPr>
+        <w:lastRenderedPageBreak/>
+        <w:t xml:space="preserve">from being able to respond to vital signals like </w:t>
       </w:r>
       <w:r>
         <w:rPr>
@@ -530,7 +562,6 @@
         <w:spacing w:before="120"/>
       </w:pPr>
       <w:r>
-        <w:lastRenderedPageBreak/>
         <w:t>I</w:t>
       </w:r>
       <w:r>
@@ -580,21 +611,7 @@
         <w:rPr>
           <w:highlight w:val="yellow"/>
         </w:rPr>
-        <w:t xml:space="preserve">Broadly speaking, the priorities of interrupts are "design decisions set by negotiation between software and hardware engineers." The selector handles priorities of signals based on the condition's numbers 0, 1, 2, ..., S-1 with priorities assigned according to the system design (note: priority ordering varies by system architecture). Generally, hardware-detected interrupts for critical events take priority over software-initiated requests. Hardware events include "divide by zero", "overflow", page faults, </w:t>
-      </w:r>
-      <w:proofErr w:type="spellStart"/>
-      <w:r>
-        <w:rPr>
-          <w:highlight w:val="yellow"/>
-        </w:rPr>
-        <w:t>etc</w:t>
-      </w:r>
-      <w:proofErr w:type="spellEnd"/>
-      <w:r>
-        <w:rPr>
-          <w:highlight w:val="yellow"/>
-        </w:rPr>
-        <w:t xml:space="preserve"> which are detected by the ALU/MMU and require immediate handling. Lower priority interrupts include software requests like microkernel system calls (KC) which can be deferred.</w:t>
+        <w:t>Broadly speaking, the priorities of interrupts are "design decisions set by negotiation between software and hardware engineers." The selector handles priorities of signals based on the condition's numbers 0, 1, 2, ..., S-1 with priorities assigned according to the system design (note: priority ordering varies by system architecture). Generally, hardware-detected interrupts for critical events take priority over software-initiated requests. Hardware events include "divide by zero", "overflow", page faults, etc which are detected by the ALU/MMU and require immediate handling. Lower priority interrupts include software requests like microkernel system calls (KC) which can be deferred.</w:t>
       </w:r>
     </w:p>
     <w:p>
@@ -878,7 +895,6 @@
       <w:r>
         <w:t xml:space="preserve">Suppose </w:t>
       </w:r>
-      <w:proofErr w:type="gramStart"/>
       <w:r>
         <w:rPr>
           <w:rFonts w:ascii="Lucida Console" w:hAnsi="Lucida Console"/>
@@ -887,11 +903,7 @@
         <w:t>KV[72]</w:t>
       </w:r>
       <w:r>
-        <w:t>=</w:t>
-      </w:r>
-      <w:proofErr w:type="gramEnd"/>
-      <w:r>
-        <w:t>”</w:t>
+        <w:t>=”</w:t>
       </w:r>
       <w:r>
         <w:rPr>
@@ -904,15 +916,7 @@
         <w:t>”.  A</w:t>
       </w:r>
       <w:r>
-        <w:t xml:space="preserve"> user wanting to create a process </w:t>
-      </w:r>
-      <w:proofErr w:type="gramStart"/>
-      <w:r>
-        <w:t>says</w:t>
-      </w:r>
-      <w:proofErr w:type="gramEnd"/>
-      <w:r>
-        <w:t xml:space="preserve"> “</w:t>
+        <w:t xml:space="preserve"> user wanting to create a process says “</w:t>
       </w:r>
       <w:r>
         <w:rPr>
@@ -1060,6 +1064,7 @@
         <w:rPr>
           <w:highlight w:val="yellow"/>
         </w:rPr>
+        <w:lastRenderedPageBreak/>
         <w:t>The OS won’t allow a user to enter</w:t>
       </w:r>
       <w:r>
@@ -1086,6 +1091,9 @@
         <w:pStyle w:val="p2"/>
         <w:spacing w:before="120"/>
         <w:ind w:left="1440"/>
+        <w:rPr>
+          <w:color w:val="EE0000"/>
+        </w:rPr>
       </w:pPr>
       <w:r>
         <w:rPr>
@@ -1109,7 +1117,6 @@
         <w:rPr>
           <w:highlight w:val="yellow"/>
         </w:rPr>
-        <w:lastRenderedPageBreak/>
         <w:t xml:space="preserve">kernel space </w:t>
       </w:r>
       <w:r>
@@ -1134,21 +1141,7 @@
         <w:rPr>
           <w:color w:val="EE0000"/>
         </w:rPr>
-        <w:t xml:space="preserve">(How? If I enter a kernel routine, I </w:t>
-      </w:r>
-      <w:proofErr w:type="gramStart"/>
-      <w:r>
-        <w:rPr>
-          <w:color w:val="EE0000"/>
-        </w:rPr>
-        <w:t>have to</w:t>
-      </w:r>
-      <w:proofErr w:type="gramEnd"/>
-      <w:r>
-        <w:rPr>
-          <w:color w:val="EE0000"/>
-        </w:rPr>
-        <w:t xml:space="preserve"> follow its instructions. </w:t>
+        <w:t xml:space="preserve">(How? If I enter a kernel routine, I have to follow its instructions. </w:t>
       </w:r>
       <w:r>
         <w:rPr>
@@ -1156,19 +1149,11 @@
         </w:rPr>
         <w:t xml:space="preserve"> Those instructions won’t include writing malware.) </w:t>
       </w:r>
-      <w:proofErr w:type="gramStart"/>
-      <w:r>
-        <w:rPr>
-          <w:highlight w:val="yellow"/>
-        </w:rPr>
-        <w:t>In</w:t>
-      </w:r>
-      <w:proofErr w:type="gramEnd"/>
-      <w:r>
-        <w:rPr>
-          <w:highlight w:val="yellow"/>
-        </w:rPr>
-        <w:t xml:space="preserve"> order to prevent the user from accessing this protected part of memory, and further masking its exact location, we add a layer of indirection</w:t>
+      <w:r>
+        <w:rPr>
+          <w:highlight w:val="yellow"/>
+        </w:rPr>
+        <w:t>In order to prevent the user from accessing this protected part of memory, and further masking its exact location, we add a layer of indirection</w:t>
       </w:r>
       <w:r>
         <w:rPr>
@@ -1214,6 +1199,49 @@
           <w:color w:val="EE0000"/>
         </w:rPr>
         <w:t>because KV[k] is in protected kernel memory.</w:t>
+      </w:r>
+    </w:p>
+    <w:p>
+      <w:pPr>
+        <w:pStyle w:val="p2"/>
+        <w:spacing w:before="120"/>
+        <w:ind w:left="1440"/>
+      </w:pPr>
+      <w:r>
+        <w:rPr>
+          <w:color w:val="EE0000"/>
+        </w:rPr>
+        <w:t>We want to hide the address from the user (bc they can do math on a # and that is bad bc they can do bad st</w:t>
+      </w:r>
+      <w:r>
+        <w:rPr>
+          <w:color w:val="EE0000"/>
+        </w:rPr>
+        <w:t>uff</w:t>
+      </w:r>
+      <w:r>
+        <w:rPr>
+          <w:color w:val="EE0000"/>
+        </w:rPr>
+        <w:t xml:space="preserve">). If you try to access </w:t>
+      </w:r>
+      <w:r>
+        <w:rPr>
+          <w:color w:val="EE0000"/>
+        </w:rPr>
+        <w:t xml:space="preserve">the memory even if you had the kernel space memory, you will trigger </w:t>
+      </w:r>
+      <w:r>
+        <w:rPr>
+          <w:color w:val="EE0000"/>
+        </w:rPr>
+        <w:t xml:space="preserve">a memory protection interrupt error. If you don’t go via the i-check process where KC calls are triggered </w:t>
+      </w:r>
+      <w:r>
+        <w:rPr>
+          <w:color w:val="EE0000"/>
+        </w:rPr>
+        <w:t>via transistors, you can’t access that memory location.</w:t>
       </w:r>
     </w:p>
     <w:p>
@@ -1419,6 +1447,7 @@
           <w:bCs/>
           <w:color w:val="EE0000"/>
         </w:rPr>
+        <w:lastRenderedPageBreak/>
         <w:t>(</w:t>
       </w:r>
       <w:r>
@@ -1520,21 +1549,7 @@
         <w:rPr>
           <w:highlight w:val="yellow"/>
         </w:rPr>
-        <w:t xml:space="preserve"> original user state) and the Program Counter (IP) </w:t>
-      </w:r>
-      <w:proofErr w:type="gramStart"/>
-      <w:r>
-        <w:rPr>
-          <w:highlight w:val="yellow"/>
-        </w:rPr>
-        <w:t>( points</w:t>
-      </w:r>
-      <w:proofErr w:type="gramEnd"/>
-      <w:r>
-        <w:rPr>
-          <w:highlight w:val="yellow"/>
-        </w:rPr>
-        <w:t xml:space="preserve"> to the interrupted instruction). </w:t>
+        <w:t xml:space="preserve"> original user state) and the Program Counter (IP) ( points to the interrupted instruction). </w:t>
       </w:r>
     </w:p>
     <w:p>
@@ -1552,7 +1567,6 @@
         <w:rPr>
           <w:highlight w:val="yellow"/>
         </w:rPr>
-        <w:lastRenderedPageBreak/>
         <w:t xml:space="preserve">Security and Control: This mode switching is an orchestrated hardware/OS function, not something that a specific kernel routine itself should explicitly command. Kernel routines are privileged and require protected entry; the exit mechanism is similarly controlled by the system to maintain integrity. </w:t>
       </w:r>
     </w:p>

</xml_diff>